<commit_message>
First draft of all solutions
</commit_message>
<xml_diff>
--- a/RLock/NFLPoints/Module/NFLPointsSolutions2.docx
+++ b/RLock/NFLPoints/Module/NFLPointsSolutions2.docx
@@ -331,14 +331,7 @@
               <w:rFonts w:ascii="Cambria Math" w:hAnsi="Cambria Math" w:cs="Times New Roman"/>
               <w:color w:val="EE0000"/>
             </w:rPr>
-            <m:t>=0.</m:t>
-          </m:r>
-          <m:r>
-            <w:rPr>
-              <w:rFonts w:ascii="Cambria Math" w:hAnsi="Cambria Math" w:cs="Times New Roman"/>
-              <w:color w:val="EE0000"/>
-            </w:rPr>
-            <m:t>539</m:t>
+            <m:t>=0.539</m:t>
           </m:r>
         </m:oMath>
       </m:oMathPara>
@@ -644,7 +637,92 @@
           <w:rFonts w:ascii="Times New Roman" w:hAnsi="Times New Roman" w:cs="Times New Roman"/>
           <w:color w:val="EE0000"/>
         </w:rPr>
-        <w:t xml:space="preserve"> (one sample)</w:t>
+        <w:t xml:space="preserve"> (one sample</w:t>
+      </w:r>
+      <w:r>
+        <w:rPr>
+          <w:rFonts w:ascii="Times New Roman" w:hAnsi="Times New Roman" w:cs="Times New Roman"/>
+          <w:color w:val="EE0000"/>
+        </w:rPr>
+        <w:t xml:space="preserve"> using </w:t>
+      </w:r>
+      <w:proofErr w:type="spellStart"/>
+      <w:r>
+        <w:rPr>
+          <w:rFonts w:ascii="Times New Roman" w:hAnsi="Times New Roman" w:cs="Times New Roman"/>
+          <w:i/>
+          <w:iCs/>
+          <w:color w:val="EE0000"/>
+        </w:rPr>
+        <w:t>HomeDiff</w:t>
+      </w:r>
+      <w:proofErr w:type="spellEnd"/>
+      <w:r>
+        <w:rPr>
+          <w:rFonts w:ascii="Times New Roman" w:hAnsi="Times New Roman" w:cs="Times New Roman"/>
+          <w:color w:val="EE0000"/>
+        </w:rPr>
+        <w:t>)</w:t>
+      </w:r>
+      <w:r>
+        <w:rPr>
+          <w:rFonts w:ascii="Times New Roman" w:hAnsi="Times New Roman" w:cs="Times New Roman"/>
+          <w:color w:val="EE0000"/>
+        </w:rPr>
+        <w:t xml:space="preserve"> OR</w:t>
+      </w:r>
+    </w:p>
+    <w:p>
+      <w:pPr>
+        <w:spacing w:line="240" w:lineRule="auto"/>
+        <w:ind w:left="1080"/>
+        <w:rPr>
+          <w:rFonts w:ascii="Times New Roman" w:hAnsi="Times New Roman" w:cs="Times New Roman"/>
+          <w:color w:val="EE0000"/>
+        </w:rPr>
+      </w:pPr>
+      <w:r>
+        <w:rPr>
+          <w:rFonts w:ascii="Times New Roman" w:hAnsi="Times New Roman" w:cs="Times New Roman"/>
+          <w:color w:val="EE0000"/>
+        </w:rPr>
+        <w:t xml:space="preserve">Test for two means (paired data., using </w:t>
+      </w:r>
+      <w:proofErr w:type="spellStart"/>
+      <w:r>
+        <w:rPr>
+          <w:rFonts w:ascii="Times New Roman" w:hAnsi="Times New Roman" w:cs="Times New Roman"/>
+          <w:i/>
+          <w:iCs/>
+          <w:color w:val="EE0000"/>
+        </w:rPr>
+        <w:t>HomeScore</w:t>
+      </w:r>
+      <w:proofErr w:type="spellEnd"/>
+      <w:r>
+        <w:rPr>
+          <w:rFonts w:ascii="Times New Roman" w:hAnsi="Times New Roman" w:cs="Times New Roman"/>
+          <w:color w:val="EE0000"/>
+        </w:rPr>
+        <w:t xml:space="preserve"> and </w:t>
+      </w:r>
+      <w:proofErr w:type="spellStart"/>
+      <w:r>
+        <w:rPr>
+          <w:rFonts w:ascii="Times New Roman" w:hAnsi="Times New Roman" w:cs="Times New Roman"/>
+          <w:i/>
+          <w:iCs/>
+          <w:color w:val="EE0000"/>
+        </w:rPr>
+        <w:t>AwayScore</w:t>
+      </w:r>
+      <w:proofErr w:type="spellEnd"/>
+      <w:r>
+        <w:rPr>
+          <w:rFonts w:ascii="Times New Roman" w:hAnsi="Times New Roman" w:cs="Times New Roman"/>
+          <w:color w:val="EE0000"/>
+        </w:rPr>
+        <w:t>)</w:t>
       </w:r>
     </w:p>
     <w:p>
@@ -725,35 +803,7 @@
           <w:rFonts w:ascii="Times New Roman" w:eastAsiaTheme="minorEastAsia" w:hAnsi="Times New Roman" w:cs="Times New Roman"/>
           <w:color w:val="EE0000"/>
         </w:rPr>
-        <w:t xml:space="preserve">t=-1.74. p-value=0.083. </w:t>
-      </w:r>
-      <w:r>
-        <w:rPr>
-          <w:rFonts w:ascii="Times New Roman" w:eastAsiaTheme="minorEastAsia" w:hAnsi="Times New Roman" w:cs="Times New Roman"/>
-          <w:color w:val="EE0000"/>
-        </w:rPr>
-        <w:t xml:space="preserve">At a 5% significance level we do not have convincing evidence that the </w:t>
-      </w:r>
-      <w:r>
-        <w:rPr>
-          <w:rFonts w:ascii="Times New Roman" w:eastAsiaTheme="minorEastAsia" w:hAnsi="Times New Roman" w:cs="Times New Roman"/>
-          <w:color w:val="EE0000"/>
-        </w:rPr>
-        <w:t>mean home margin is</w:t>
-      </w:r>
-      <w:r>
-        <w:rPr>
-          <w:rFonts w:ascii="Times New Roman" w:eastAsiaTheme="minorEastAsia" w:hAnsi="Times New Roman" w:cs="Times New Roman"/>
-          <w:color w:val="EE0000"/>
-        </w:rPr>
-        <w:t xml:space="preserve"> different from </w:t>
-      </w:r>
-      <w:r>
-        <w:rPr>
-          <w:rFonts w:ascii="Times New Roman" w:eastAsiaTheme="minorEastAsia" w:hAnsi="Times New Roman" w:cs="Times New Roman"/>
-          <w:color w:val="EE0000"/>
-        </w:rPr>
-        <w:t>3 points.</w:t>
+        <w:t>t=-1.74. p-value=0.083. At a 5% significance level we do not have convincing evidence that the mean home margin is different from 3 points.</w:t>
       </w:r>
     </w:p>
     <w:p>
@@ -917,14 +967,7 @@
                   <w:rFonts w:ascii="Cambria Math" w:hAnsi="Cambria Math" w:cs="Times New Roman"/>
                   <w:color w:val="EE0000"/>
                 </w:rPr>
-                <m:t>H</m:t>
-              </m:r>
-              <m:r>
-                <w:rPr>
-                  <w:rFonts w:ascii="Cambria Math" w:hAnsi="Cambria Math" w:cs="Times New Roman"/>
-                  <w:color w:val="EE0000"/>
-                </w:rPr>
-                <m:t>P</m:t>
+                <m:t>HP</m:t>
               </m:r>
             </m:sub>
           </m:sSub>
@@ -933,14 +976,7 @@
               <w:rFonts w:ascii="Cambria Math" w:hAnsi="Cambria Math" w:cs="Times New Roman"/>
               <w:color w:val="EE0000"/>
             </w:rPr>
-            <m:t>=</m:t>
-          </m:r>
-          <m:r>
-            <w:rPr>
-              <w:rFonts w:ascii="Cambria Math" w:hAnsi="Cambria Math" w:cs="Times New Roman"/>
-              <w:color w:val="EE0000"/>
-            </w:rPr>
-            <m:t>1.480</m:t>
+            <m:t>=1.480</m:t>
           </m:r>
         </m:oMath>
       </m:oMathPara>
@@ -959,21 +995,7 @@
           <w:rFonts w:ascii="Times New Roman" w:eastAsiaTheme="minorEastAsia" w:hAnsi="Times New Roman" w:cs="Times New Roman"/>
           <w:color w:val="EE0000"/>
         </w:rPr>
-        <w:t>t=-</w:t>
-      </w:r>
-      <w:r>
-        <w:rPr>
-          <w:rFonts w:ascii="Times New Roman" w:eastAsiaTheme="minorEastAsia" w:hAnsi="Times New Roman" w:cs="Times New Roman"/>
-          <w:color w:val="EE0000"/>
-        </w:rPr>
-        <w:t>6.51</w:t>
-      </w:r>
-      <w:r>
-        <w:rPr>
-          <w:rFonts w:ascii="Times New Roman" w:eastAsiaTheme="minorEastAsia" w:hAnsi="Times New Roman" w:cs="Times New Roman"/>
-          <w:color w:val="EE0000"/>
-        </w:rPr>
-        <w:t>. p-value</w:t>
+        <w:t>t=-6.51. p-value</w:t>
       </w:r>
       <m:oMath>
         <m:r>
@@ -989,28 +1011,7 @@
           <w:rFonts w:ascii="Times New Roman" w:eastAsiaTheme="minorEastAsia" w:hAnsi="Times New Roman" w:cs="Times New Roman"/>
           <w:color w:val="EE0000"/>
         </w:rPr>
-        <w:t>0.0</w:t>
-      </w:r>
-      <w:r>
-        <w:rPr>
-          <w:rFonts w:ascii="Times New Roman" w:eastAsiaTheme="minorEastAsia" w:hAnsi="Times New Roman" w:cs="Times New Roman"/>
-          <w:color w:val="EE0000"/>
-        </w:rPr>
-        <w:t>00</w:t>
-      </w:r>
-      <w:r>
-        <w:rPr>
-          <w:rFonts w:ascii="Times New Roman" w:eastAsiaTheme="minorEastAsia" w:hAnsi="Times New Roman" w:cs="Times New Roman"/>
-          <w:color w:val="EE0000"/>
-        </w:rPr>
-        <w:t xml:space="preserve">. </w:t>
-      </w:r>
-      <w:r>
-        <w:rPr>
-          <w:rFonts w:ascii="Times New Roman" w:eastAsiaTheme="minorEastAsia" w:hAnsi="Times New Roman" w:cs="Times New Roman"/>
-          <w:color w:val="EE0000"/>
-        </w:rPr>
-        <w:t xml:space="preserve">We have very strong </w:t>
+        <w:t xml:space="preserve">0.000. We have very strong </w:t>
       </w:r>
       <w:proofErr w:type="gramStart"/>
       <w:r>
@@ -1178,14 +1179,7 @@
               <w:rFonts w:ascii="Cambria Math" w:hAnsi="Cambria Math" w:cs="Times New Roman"/>
               <w:color w:val="EE0000"/>
             </w:rPr>
-            <m:t>=</m:t>
-          </m:r>
-          <m:r>
-            <w:rPr>
-              <w:rFonts w:ascii="Cambria Math" w:hAnsi="Cambria Math" w:cs="Times New Roman"/>
-              <w:color w:val="EE0000"/>
-            </w:rPr>
-            <m:t>-1.05</m:t>
+            <m:t>=-1.05</m:t>
           </m:r>
         </m:oMath>
       </m:oMathPara>
@@ -1204,28 +1198,7 @@
           <w:rFonts w:ascii="Times New Roman" w:hAnsi="Times New Roman" w:cs="Times New Roman"/>
           <w:color w:val="EE0000"/>
         </w:rPr>
-        <w:t xml:space="preserve">We are 95% sure that the </w:t>
-      </w:r>
-      <w:r>
-        <w:rPr>
-          <w:rFonts w:ascii="Times New Roman" w:hAnsi="Times New Roman" w:cs="Times New Roman"/>
-          <w:color w:val="EE0000"/>
-        </w:rPr>
-        <w:t xml:space="preserve">mean point </w:t>
-      </w:r>
-      <w:r>
-        <w:rPr>
-          <w:rFonts w:ascii="Times New Roman" w:hAnsi="Times New Roman" w:cs="Times New Roman"/>
-          <w:color w:val="EE0000"/>
-        </w:rPr>
-        <w:t xml:space="preserve">spread </w:t>
-      </w:r>
-      <w:r>
-        <w:rPr>
-          <w:rFonts w:ascii="Times New Roman" w:hAnsi="Times New Roman" w:cs="Times New Roman"/>
-          <w:color w:val="EE0000"/>
-        </w:rPr>
-        <w:t xml:space="preserve">is between 2.16 points less and 0.05 points more than the actual margin for the </w:t>
+        <w:t xml:space="preserve">We are 95% sure that the mean point spread is between 2.16 points less and 0.05 points more than the actual margin for the </w:t>
       </w:r>
       <w:r>
         <w:rPr>
@@ -1275,7 +1248,6 @@
         </w:rPr>
         <w:t xml:space="preserve">) tend, on average,  to </w:t>
       </w:r>
-      <w:proofErr w:type="spellStart"/>
       <w:r>
         <w:rPr>
           <w:rFonts w:ascii="Times New Roman" w:hAnsi="Times New Roman" w:cs="Times New Roman"/>
@@ -1286,14 +1258,13 @@
         <w:rPr>
           <w:rFonts w:ascii="Times New Roman" w:hAnsi="Times New Roman" w:cs="Times New Roman"/>
         </w:rPr>
-        <w:t>stimate</w:t>
-      </w:r>
-      <w:proofErr w:type="spellEnd"/>
-      <w:r>
-        <w:rPr>
-          <w:rFonts w:ascii="Times New Roman" w:hAnsi="Times New Roman" w:cs="Times New Roman"/>
-        </w:rPr>
-        <w:t xml:space="preserve"> the margin for the favored team (</w:t>
+        <w:t>e</w:t>
+      </w:r>
+      <w:r>
+        <w:rPr>
+          <w:rFonts w:ascii="Times New Roman" w:hAnsi="Times New Roman" w:cs="Times New Roman"/>
+        </w:rPr>
+        <w:t>stimate the margin for the favored team (</w:t>
       </w:r>
       <w:proofErr w:type="spellStart"/>
       <w:r>
@@ -1407,14 +1378,7 @@
           <w:rFonts w:ascii="Times New Roman" w:eastAsiaTheme="minorEastAsia" w:hAnsi="Times New Roman" w:cs="Times New Roman"/>
           <w:color w:val="EE0000"/>
         </w:rPr>
-        <w:t>t=-</w:t>
-      </w:r>
-      <w:r>
-        <w:rPr>
-          <w:rFonts w:ascii="Times New Roman" w:eastAsiaTheme="minorEastAsia" w:hAnsi="Times New Roman" w:cs="Times New Roman"/>
-          <w:color w:val="EE0000"/>
-        </w:rPr>
-        <w:t>1.87</w:t>
+        <w:t>t=-1.87</w:t>
       </w:r>
       <w:r>
         <w:rPr>
@@ -1444,81 +1408,7 @@
           <w:rFonts w:ascii="Times New Roman" w:eastAsiaTheme="minorEastAsia" w:hAnsi="Times New Roman" w:cs="Times New Roman"/>
           <w:color w:val="EE0000"/>
         </w:rPr>
-        <w:t>0.0</w:t>
-      </w:r>
-      <w:r>
-        <w:rPr>
-          <w:rFonts w:ascii="Times New Roman" w:eastAsiaTheme="minorEastAsia" w:hAnsi="Times New Roman" w:cs="Times New Roman"/>
-          <w:color w:val="EE0000"/>
-        </w:rPr>
-        <w:t>31</w:t>
-      </w:r>
-      <w:r>
-        <w:rPr>
-          <w:rFonts w:ascii="Times New Roman" w:eastAsiaTheme="minorEastAsia" w:hAnsi="Times New Roman" w:cs="Times New Roman"/>
-          <w:color w:val="EE0000"/>
-        </w:rPr>
-        <w:t xml:space="preserve">. </w:t>
-      </w:r>
-      <w:r>
-        <w:rPr>
-          <w:rFonts w:ascii="Times New Roman" w:eastAsiaTheme="minorEastAsia" w:hAnsi="Times New Roman" w:cs="Times New Roman"/>
-          <w:color w:val="EE0000"/>
-        </w:rPr>
-        <w:t>At a 5% level we have enough</w:t>
-      </w:r>
-      <w:r>
-        <w:rPr>
-          <w:rFonts w:ascii="Times New Roman" w:eastAsiaTheme="minorEastAsia" w:hAnsi="Times New Roman" w:cs="Times New Roman"/>
-          <w:color w:val="EE0000"/>
-        </w:rPr>
-        <w:t xml:space="preserve"> evidence </w:t>
-      </w:r>
-      <w:r>
-        <w:rPr>
-          <w:rFonts w:ascii="Times New Roman" w:eastAsiaTheme="minorEastAsia" w:hAnsi="Times New Roman" w:cs="Times New Roman"/>
-          <w:color w:val="EE0000"/>
-        </w:rPr>
-        <w:t xml:space="preserve">to conclude that the mean point spreads </w:t>
-      </w:r>
-      <w:proofErr w:type="gramStart"/>
-      <w:r>
-        <w:rPr>
-          <w:rFonts w:ascii="Times New Roman" w:eastAsiaTheme="minorEastAsia" w:hAnsi="Times New Roman" w:cs="Times New Roman"/>
-          <w:color w:val="EE0000"/>
-        </w:rPr>
-        <w:t>is</w:t>
-      </w:r>
-      <w:proofErr w:type="gramEnd"/>
-      <w:r>
-        <w:rPr>
-          <w:rFonts w:ascii="Times New Roman" w:eastAsiaTheme="minorEastAsia" w:hAnsi="Times New Roman" w:cs="Times New Roman"/>
-          <w:color w:val="EE0000"/>
-        </w:rPr>
-        <w:t xml:space="preserve"> less than the mean actual margin for the </w:t>
-      </w:r>
-      <w:proofErr w:type="gramStart"/>
-      <w:r>
-        <w:rPr>
-          <w:rFonts w:ascii="Times New Roman" w:eastAsiaTheme="minorEastAsia" w:hAnsi="Times New Roman" w:cs="Times New Roman"/>
-          <w:color w:val="EE0000"/>
-        </w:rPr>
-        <w:t>favored team</w:t>
-      </w:r>
-      <w:proofErr w:type="gramEnd"/>
-      <w:r>
-        <w:rPr>
-          <w:rFonts w:ascii="Times New Roman" w:eastAsiaTheme="minorEastAsia" w:hAnsi="Times New Roman" w:cs="Times New Roman"/>
-          <w:color w:val="EE0000"/>
-        </w:rPr>
-        <w:t xml:space="preserve">. </w:t>
-      </w:r>
-      <w:r>
-        <w:rPr>
-          <w:rFonts w:ascii="Times New Roman" w:eastAsiaTheme="minorEastAsia" w:hAnsi="Times New Roman" w:cs="Times New Roman"/>
-          <w:color w:val="EE0000"/>
-        </w:rPr>
-        <w:t xml:space="preserve"> </w:t>
+        <w:t xml:space="preserve">0.031. At a 5% level we have enough evidence to conclude that the mean point spread is less than the mean actual margin for the favored team.  </w:t>
       </w:r>
     </w:p>
     <w:p>
@@ -1649,14 +1539,7 @@
               <w:rFonts w:ascii="Cambria Math" w:hAnsi="Cambria Math" w:cs="Times New Roman"/>
               <w:color w:val="EE0000"/>
             </w:rPr>
-            <m:t>=</m:t>
-          </m:r>
-          <m:r>
-            <w:rPr>
-              <w:rFonts w:ascii="Cambria Math" w:hAnsi="Cambria Math" w:cs="Times New Roman"/>
-              <w:color w:val="EE0000"/>
-            </w:rPr>
-            <m:t>10.03</m:t>
+            <m:t>=10.03</m:t>
           </m:r>
         </m:oMath>
       </m:oMathPara>
@@ -2104,7 +1987,7 @@
                   <w:rFonts w:ascii="Cambria Math" w:hAnsi="Cambria Math" w:cs="Times New Roman"/>
                   <w:color w:val="EE0000"/>
                 </w:rPr>
-                <m:t>2</m:t>
+                <m:t>1</m:t>
               </m:r>
             </m:sub>
           </m:sSub>
@@ -2161,7 +2044,7 @@
                   <w:rFonts w:ascii="Cambria Math" w:eastAsiaTheme="minorEastAsia" w:hAnsi="Cambria Math" w:cs="Times New Roman"/>
                   <w:color w:val="EE0000"/>
                 </w:rPr>
-                <m:t>1</m:t>
+                <m:t>2</m:t>
               </m:r>
             </m:sub>
           </m:sSub>
@@ -2170,7 +2053,35 @@
               <w:rFonts w:ascii="Cambria Math" w:eastAsiaTheme="minorEastAsia" w:hAnsi="Cambria Math" w:cs="Times New Roman"/>
               <w:color w:val="EE0000"/>
             </w:rPr>
-            <m:t>=9.65-10.40=-0.75</m:t>
+            <m:t>=</m:t>
+          </m:r>
+          <m:r>
+            <w:rPr>
+              <w:rFonts w:ascii="Cambria Math" w:eastAsiaTheme="minorEastAsia" w:hAnsi="Cambria Math" w:cs="Times New Roman"/>
+              <w:color w:val="EE0000"/>
+            </w:rPr>
+            <m:t>10.40</m:t>
+          </m:r>
+          <m:r>
+            <w:rPr>
+              <w:rFonts w:ascii="Cambria Math" w:eastAsiaTheme="minorEastAsia" w:hAnsi="Cambria Math" w:cs="Times New Roman"/>
+              <w:color w:val="EE0000"/>
+            </w:rPr>
+            <m:t>-</m:t>
+          </m:r>
+          <m:r>
+            <w:rPr>
+              <w:rFonts w:ascii="Cambria Math" w:eastAsiaTheme="minorEastAsia" w:hAnsi="Cambria Math" w:cs="Times New Roman"/>
+              <w:color w:val="EE0000"/>
+            </w:rPr>
+            <m:t>9.65</m:t>
+          </m:r>
+          <m:r>
+            <w:rPr>
+              <w:rFonts w:ascii="Cambria Math" w:eastAsiaTheme="minorEastAsia" w:hAnsi="Cambria Math" w:cs="Times New Roman"/>
+              <w:color w:val="EE0000"/>
+            </w:rPr>
+            <m:t>=-0.75</m:t>
           </m:r>
         </m:oMath>
       </m:oMathPara>
@@ -2189,72 +2100,35 @@
           <w:rFonts w:ascii="Times New Roman" w:eastAsiaTheme="minorEastAsia" w:hAnsi="Times New Roman" w:cs="Times New Roman"/>
           <w:color w:val="EE0000"/>
         </w:rPr>
-        <w:t>t</w:t>
+        <w:t>t=1.03, p-value=0.152.  We do not have convincing evidence that the mean absolute difference between the point spread</w:t>
       </w:r>
       <w:r>
         <w:rPr>
           <w:rFonts w:ascii="Times New Roman" w:eastAsiaTheme="minorEastAsia" w:hAnsi="Times New Roman" w:cs="Times New Roman"/>
           <w:color w:val="EE0000"/>
         </w:rPr>
-        <w:t>=</w:t>
+        <w:t>s</w:t>
       </w:r>
       <w:r>
         <w:rPr>
           <w:rFonts w:ascii="Times New Roman" w:eastAsiaTheme="minorEastAsia" w:hAnsi="Times New Roman" w:cs="Times New Roman"/>
           <w:color w:val="EE0000"/>
         </w:rPr>
-        <w:t>1.03</w:t>
+        <w:t xml:space="preserve"> and actual game margin</w:t>
       </w:r>
       <w:r>
         <w:rPr>
           <w:rFonts w:ascii="Times New Roman" w:eastAsiaTheme="minorEastAsia" w:hAnsi="Times New Roman" w:cs="Times New Roman"/>
           <w:color w:val="EE0000"/>
         </w:rPr>
-        <w:t>, p-value=0.</w:t>
+        <w:t>s</w:t>
       </w:r>
       <w:r>
         <w:rPr>
           <w:rFonts w:ascii="Times New Roman" w:eastAsiaTheme="minorEastAsia" w:hAnsi="Times New Roman" w:cs="Times New Roman"/>
           <w:color w:val="EE0000"/>
         </w:rPr>
-        <w:t>15</w:t>
-      </w:r>
-      <w:r>
-        <w:rPr>
-          <w:rFonts w:ascii="Times New Roman" w:eastAsiaTheme="minorEastAsia" w:hAnsi="Times New Roman" w:cs="Times New Roman"/>
-          <w:color w:val="EE0000"/>
-        </w:rPr>
-        <w:t xml:space="preserve">2.  We do not have convincing evidence that the </w:t>
-      </w:r>
-      <w:r>
-        <w:rPr>
-          <w:rFonts w:ascii="Times New Roman" w:eastAsiaTheme="minorEastAsia" w:hAnsi="Times New Roman" w:cs="Times New Roman"/>
-          <w:color w:val="EE0000"/>
-        </w:rPr>
-        <w:t xml:space="preserve">mean absolute difference between the point </w:t>
-      </w:r>
-      <w:proofErr w:type="gramStart"/>
-      <w:r>
-        <w:rPr>
-          <w:rFonts w:ascii="Times New Roman" w:eastAsiaTheme="minorEastAsia" w:hAnsi="Times New Roman" w:cs="Times New Roman"/>
-          <w:color w:val="EE0000"/>
-        </w:rPr>
-        <w:t>spread</w:t>
-      </w:r>
-      <w:proofErr w:type="gramEnd"/>
-      <w:r>
-        <w:rPr>
-          <w:rFonts w:ascii="Times New Roman" w:eastAsiaTheme="minorEastAsia" w:hAnsi="Times New Roman" w:cs="Times New Roman"/>
-          <w:color w:val="EE0000"/>
-        </w:rPr>
-        <w:t xml:space="preserve"> and actual game margin is smaller in the second half of the season th</w:t>
-      </w:r>
-      <w:r>
-        <w:rPr>
-          <w:rFonts w:ascii="Times New Roman" w:eastAsiaTheme="minorEastAsia" w:hAnsi="Times New Roman" w:cs="Times New Roman"/>
-          <w:color w:val="EE0000"/>
-        </w:rPr>
-        <w:t xml:space="preserve">an in the first half. </w:t>
+        <w:t xml:space="preserve"> is smaller in the second half of the season than in the first half. </w:t>
       </w:r>
     </w:p>
     <w:p>
@@ -2513,14 +2387,7 @@
               <w:rFonts w:ascii="Cambria Math" w:hAnsi="Cambria Math" w:cs="Times New Roman"/>
               <w:color w:val="EE0000"/>
             </w:rPr>
-            <m:t>=0.</m:t>
-          </m:r>
-          <m:r>
-            <w:rPr>
-              <w:rFonts w:ascii="Cambria Math" w:hAnsi="Cambria Math" w:cs="Times New Roman"/>
-              <w:color w:val="EE0000"/>
-            </w:rPr>
-            <m:t>392</m:t>
+            <m:t>=0.392</m:t>
           </m:r>
         </m:oMath>
       </m:oMathPara>
@@ -2539,35 +2406,7 @@
           <w:rFonts w:ascii="Times New Roman" w:hAnsi="Times New Roman" w:cs="Times New Roman"/>
           <w:color w:val="EE0000"/>
         </w:rPr>
-        <w:t>We are 95% sure that the proportion of times the favored team wins the game is between 0.</w:t>
-      </w:r>
-      <w:r>
-        <w:rPr>
-          <w:rFonts w:ascii="Times New Roman" w:hAnsi="Times New Roman" w:cs="Times New Roman"/>
-          <w:color w:val="EE0000"/>
-        </w:rPr>
-        <w:t>35</w:t>
-      </w:r>
-      <w:r>
-        <w:rPr>
-          <w:rFonts w:ascii="Times New Roman" w:hAnsi="Times New Roman" w:cs="Times New Roman"/>
-          <w:color w:val="EE0000"/>
-        </w:rPr>
-        <w:t>1 and 0.</w:t>
-      </w:r>
-      <w:r>
-        <w:rPr>
-          <w:rFonts w:ascii="Times New Roman" w:hAnsi="Times New Roman" w:cs="Times New Roman"/>
-          <w:color w:val="EE0000"/>
-        </w:rPr>
-        <w:t>433</w:t>
-      </w:r>
-      <w:r>
-        <w:rPr>
-          <w:rFonts w:ascii="Times New Roman" w:hAnsi="Times New Roman" w:cs="Times New Roman"/>
-          <w:color w:val="EE0000"/>
-        </w:rPr>
-        <w:t>.</w:t>
+        <w:t>We are 95% sure that the proportion of times the favored team wins the game is between 0.351 and 0.433.</w:t>
       </w:r>
     </w:p>
     <w:p>
@@ -2872,14 +2711,7 @@
               <w:rFonts w:ascii="Cambria Math" w:hAnsi="Cambria Math" w:cs="Times New Roman"/>
               <w:color w:val="EE0000"/>
             </w:rPr>
-            <m:t>=</m:t>
-          </m:r>
-          <m:r>
-            <w:rPr>
-              <w:rFonts w:ascii="Cambria Math" w:hAnsi="Cambria Math" w:cs="Times New Roman"/>
-              <w:color w:val="EE0000"/>
-            </w:rPr>
-            <m:t>27.86</m:t>
+            <m:t>=27.86</m:t>
           </m:r>
         </m:oMath>
       </m:oMathPara>
@@ -2898,14 +2730,7 @@
           <w:rFonts w:ascii="Times New Roman" w:hAnsi="Times New Roman" w:cs="Times New Roman"/>
           <w:color w:val="EE0000"/>
         </w:rPr>
-        <w:t xml:space="preserve">We are 95% sure that the </w:t>
-      </w:r>
-      <w:r>
-        <w:rPr>
-          <w:rFonts w:ascii="Times New Roman" w:hAnsi="Times New Roman" w:cs="Times New Roman"/>
-          <w:color w:val="EE0000"/>
-        </w:rPr>
-        <w:t xml:space="preserve">mean points scored by the winning team in NFL games </w:t>
+        <w:t xml:space="preserve">We are 95% sure that the mean points scored by the winning team in NFL games </w:t>
       </w:r>
       <w:proofErr w:type="gramStart"/>
       <w:r>
@@ -2921,28 +2746,7 @@
           <w:rFonts w:ascii="Times New Roman" w:hAnsi="Times New Roman" w:cs="Times New Roman"/>
           <w:color w:val="EE0000"/>
         </w:rPr>
-        <w:t xml:space="preserve"> between 27.13 and </w:t>
-      </w:r>
-      <w:r>
-        <w:rPr>
-          <w:rFonts w:ascii="Times New Roman" w:hAnsi="Times New Roman" w:cs="Times New Roman"/>
-          <w:color w:val="EE0000"/>
-        </w:rPr>
-        <w:t xml:space="preserve"> </w:t>
-      </w:r>
-      <w:r>
-        <w:rPr>
-          <w:rFonts w:ascii="Times New Roman" w:hAnsi="Times New Roman" w:cs="Times New Roman"/>
-          <w:color w:val="EE0000"/>
-        </w:rPr>
-        <w:t>28.58</w:t>
-      </w:r>
-      <w:r>
-        <w:rPr>
-          <w:rFonts w:ascii="Times New Roman" w:hAnsi="Times New Roman" w:cs="Times New Roman"/>
-          <w:color w:val="EE0000"/>
-        </w:rPr>
-        <w:t xml:space="preserve"> points.</w:t>
+        <w:t xml:space="preserve"> between 27.13 and  28.58 points.</w:t>
       </w:r>
     </w:p>
     <w:p>
@@ -3121,14 +2925,7 @@
               <w:rFonts w:ascii="Cambria Math" w:hAnsi="Cambria Math" w:cs="Times New Roman"/>
               <w:color w:val="EE0000"/>
             </w:rPr>
-            <m:t>=</m:t>
-          </m:r>
-          <m:r>
-            <w:rPr>
-              <w:rFonts w:ascii="Cambria Math" w:hAnsi="Cambria Math" w:cs="Times New Roman"/>
-              <w:color w:val="EE0000"/>
-            </w:rPr>
-            <m:t>45.0-43.8=1.20</m:t>
+            <m:t>=45.0-43.8=1.20</m:t>
           </m:r>
         </m:oMath>
       </m:oMathPara>
@@ -3147,35 +2944,7 @@
           <w:rFonts w:ascii="Times New Roman" w:hAnsi="Times New Roman" w:cs="Times New Roman"/>
           <w:color w:val="EE0000"/>
         </w:rPr>
-        <w:t xml:space="preserve">We are 95% sure that the mean </w:t>
-      </w:r>
-      <w:r>
-        <w:rPr>
-          <w:rFonts w:ascii="Times New Roman" w:hAnsi="Times New Roman" w:cs="Times New Roman"/>
-          <w:color w:val="EE0000"/>
-        </w:rPr>
-        <w:t xml:space="preserve">combined </w:t>
-      </w:r>
-      <w:r>
-        <w:rPr>
-          <w:rFonts w:ascii="Times New Roman" w:hAnsi="Times New Roman" w:cs="Times New Roman"/>
-          <w:color w:val="EE0000"/>
-        </w:rPr>
-        <w:t xml:space="preserve">points scored </w:t>
-      </w:r>
-      <w:r>
-        <w:rPr>
-          <w:rFonts w:ascii="Times New Roman" w:hAnsi="Times New Roman" w:cs="Times New Roman"/>
-          <w:color w:val="EE0000"/>
-        </w:rPr>
-        <w:t xml:space="preserve">by both teams in NFL games in the second half of the season is between 1.05 less and 3.46 more than in the first half of the season. </w:t>
-      </w:r>
-      <w:r>
-        <w:rPr>
-          <w:rFonts w:ascii="Times New Roman" w:hAnsi="Times New Roman" w:cs="Times New Roman"/>
-          <w:color w:val="EE0000"/>
-        </w:rPr>
-        <w:t xml:space="preserve"> </w:t>
+        <w:t xml:space="preserve">We are 95% sure that the mean combined points scored by both teams in NFL games in the second half of the season is between 1.05 less and 3.46 more than in the first half of the season.  </w:t>
       </w:r>
     </w:p>
     <w:p>
@@ -3333,14 +3102,7 @@
               <w:rFonts w:ascii="Cambria Math" w:hAnsi="Cambria Math" w:cs="Times New Roman"/>
               <w:color w:val="EE0000"/>
             </w:rPr>
-            <m:t>=0.</m:t>
-          </m:r>
-          <m:r>
-            <w:rPr>
-              <w:rFonts w:ascii="Cambria Math" w:hAnsi="Cambria Math" w:cs="Times New Roman"/>
-              <w:color w:val="EE0000"/>
-            </w:rPr>
-            <m:t>566</m:t>
+            <m:t>=0.566</m:t>
           </m:r>
         </m:oMath>
       </m:oMathPara>
@@ -3359,49 +3121,7 @@
           <w:rFonts w:ascii="Times New Roman" w:hAnsi="Times New Roman" w:cs="Times New Roman"/>
           <w:color w:val="EE0000"/>
         </w:rPr>
-        <w:t xml:space="preserve">We are 95% sure that the proportion of times the </w:t>
-      </w:r>
-      <w:r>
-        <w:rPr>
-          <w:rFonts w:ascii="Times New Roman" w:hAnsi="Times New Roman" w:cs="Times New Roman"/>
-          <w:color w:val="EE0000"/>
-        </w:rPr>
-        <w:t>point spread is within one-half point of 3 or 7 is</w:t>
-      </w:r>
-      <w:r>
-        <w:rPr>
-          <w:rFonts w:ascii="Times New Roman" w:hAnsi="Times New Roman" w:cs="Times New Roman"/>
-          <w:color w:val="EE0000"/>
-        </w:rPr>
-        <w:t xml:space="preserve"> between </w:t>
-      </w:r>
-      <w:r>
-        <w:rPr>
-          <w:rFonts w:ascii="Times New Roman" w:hAnsi="Times New Roman" w:cs="Times New Roman"/>
-          <w:color w:val="EE0000"/>
-        </w:rPr>
-        <w:t>0.525</w:t>
-      </w:r>
-      <w:r>
-        <w:rPr>
-          <w:rFonts w:ascii="Times New Roman" w:hAnsi="Times New Roman" w:cs="Times New Roman"/>
-          <w:color w:val="EE0000"/>
-        </w:rPr>
-        <w:t xml:space="preserve"> and 0.</w:t>
-      </w:r>
-      <w:r>
-        <w:rPr>
-          <w:rFonts w:ascii="Times New Roman" w:hAnsi="Times New Roman" w:cs="Times New Roman"/>
-          <w:color w:val="EE0000"/>
-        </w:rPr>
-        <w:t>608</w:t>
-      </w:r>
-      <w:r>
-        <w:rPr>
-          <w:rFonts w:ascii="Times New Roman" w:hAnsi="Times New Roman" w:cs="Times New Roman"/>
-          <w:color w:val="EE0000"/>
-        </w:rPr>
-        <w:t>.</w:t>
+        <w:t>We are 95% sure that the proportion of times the point spread is within one-half point of 3 or 7 is between 0.525 and 0.608.</w:t>
       </w:r>
     </w:p>
     <w:p>
@@ -3674,56 +3394,7 @@
               <w:rFonts w:ascii="Cambria Math" w:hAnsi="Cambria Math" w:cs="Times New Roman"/>
               <w:color w:val="EE0000"/>
             </w:rPr>
-            <m:t>=0.</m:t>
-          </m:r>
-          <m:r>
-            <w:rPr>
-              <w:rFonts w:ascii="Cambria Math" w:hAnsi="Cambria Math" w:cs="Times New Roman"/>
-              <w:color w:val="EE0000"/>
-            </w:rPr>
-            <m:t>523</m:t>
-          </m:r>
-          <m:r>
-            <w:rPr>
-              <w:rFonts w:ascii="Cambria Math" w:hAnsi="Cambria Math" w:cs="Times New Roman"/>
-              <w:color w:val="EE0000"/>
-            </w:rPr>
-            <m:t>-0.</m:t>
-          </m:r>
-          <m:r>
-            <w:rPr>
-              <w:rFonts w:ascii="Cambria Math" w:hAnsi="Cambria Math" w:cs="Times New Roman"/>
-              <w:color w:val="EE0000"/>
-            </w:rPr>
-            <m:t>563</m:t>
-          </m:r>
-          <m:r>
-            <w:rPr>
-              <w:rFonts w:ascii="Cambria Math" w:hAnsi="Cambria Math" w:cs="Times New Roman"/>
-              <w:color w:val="EE0000"/>
-            </w:rPr>
-            <m:t>=</m:t>
-          </m:r>
-          <m:r>
-            <w:rPr>
-              <w:rFonts w:ascii="Cambria Math" w:hAnsi="Cambria Math" w:cs="Times New Roman"/>
-              <w:color w:val="EE0000"/>
-            </w:rPr>
-            <m:t>-</m:t>
-          </m:r>
-          <m:r>
-            <w:rPr>
-              <w:rFonts w:ascii="Cambria Math" w:hAnsi="Cambria Math" w:cs="Times New Roman"/>
-              <w:color w:val="EE0000"/>
-            </w:rPr>
-            <m:t>0.0</m:t>
-          </m:r>
-          <m:r>
-            <w:rPr>
-              <w:rFonts w:ascii="Cambria Math" w:hAnsi="Cambria Math" w:cs="Times New Roman"/>
-              <w:color w:val="EE0000"/>
-            </w:rPr>
-            <m:t>40</m:t>
+            <m:t>=0.523-0.563=-0.040</m:t>
           </m:r>
         </m:oMath>
       </m:oMathPara>
@@ -3855,14 +3526,7 @@
               <w:rFonts w:ascii="Cambria Math" w:hAnsi="Cambria Math" w:cs="Times New Roman"/>
               <w:color w:val="EE0000"/>
             </w:rPr>
-            <m:t>=0.</m:t>
-          </m:r>
-          <m:r>
-            <w:rPr>
-              <w:rFonts w:ascii="Cambria Math" w:hAnsi="Cambria Math" w:cs="Times New Roman"/>
-              <w:color w:val="EE0000"/>
-            </w:rPr>
-            <m:t>142</m:t>
+            <m:t>=0.142</m:t>
           </m:r>
         </m:oMath>
       </m:oMathPara>
@@ -3881,21 +3545,21 @@
           <w:rFonts w:ascii="Times New Roman" w:hAnsi="Times New Roman" w:cs="Times New Roman"/>
           <w:color w:val="EE0000"/>
         </w:rPr>
-        <w:t xml:space="preserve">We are 95% sure that the proportion of times the </w:t>
-      </w:r>
-      <w:r>
-        <w:rPr>
-          <w:rFonts w:ascii="Times New Roman" w:hAnsi="Times New Roman" w:cs="Times New Roman"/>
-          <w:color w:val="EE0000"/>
-        </w:rPr>
-        <w:t>favorite wins eh game but fails to cover the spread is between 0.112 and 0.171</w:t>
-      </w:r>
-      <w:r>
-        <w:rPr>
-          <w:rFonts w:ascii="Times New Roman" w:hAnsi="Times New Roman" w:cs="Times New Roman"/>
-          <w:color w:val="EE0000"/>
-        </w:rPr>
-        <w:t>.</w:t>
+        <w:t xml:space="preserve">We are 95% sure that the proportion of times the favorite wins </w:t>
+      </w:r>
+      <w:r>
+        <w:rPr>
+          <w:rFonts w:ascii="Times New Roman" w:hAnsi="Times New Roman" w:cs="Times New Roman"/>
+          <w:color w:val="EE0000"/>
+        </w:rPr>
+        <w:t>the</w:t>
+      </w:r>
+      <w:r>
+        <w:rPr>
+          <w:rFonts w:ascii="Times New Roman" w:hAnsi="Times New Roman" w:cs="Times New Roman"/>
+          <w:color w:val="EE0000"/>
+        </w:rPr>
+        <w:t xml:space="preserve"> game but fails to cover the spread is between 0.112 and 0.171.</w:t>
       </w:r>
     </w:p>
     <w:p>
@@ -3978,6 +3642,7 @@
         </w:rPr>
         <w:t xml:space="preserve"> and </w:t>
       </w:r>
+      <w:proofErr w:type="spellStart"/>
       <w:r>
         <w:rPr>
           <w:rFonts w:ascii="Times New Roman" w:hAnsi="Times New Roman" w:cs="Times New Roman"/>
@@ -3985,8 +3650,9 @@
           <w:iCs/>
           <w:color w:val="EE0000"/>
         </w:rPr>
-        <w:t>Away Score</w:t>
-      </w:r>
+        <w:t>AwayScore</w:t>
+      </w:r>
+      <w:proofErr w:type="spellEnd"/>
       <w:r>
         <w:rPr>
           <w:rFonts w:ascii="Times New Roman" w:hAnsi="Times New Roman" w:cs="Times New Roman"/>
@@ -4089,14 +3755,7 @@
               <w:rFonts w:ascii="Cambria Math" w:hAnsi="Cambria Math" w:cs="Times New Roman"/>
               <w:color w:val="EE0000"/>
             </w:rPr>
-            <m:t>=</m:t>
-          </m:r>
-          <m:r>
-            <w:rPr>
-              <w:rFonts w:ascii="Cambria Math" w:hAnsi="Cambria Math" w:cs="Times New Roman"/>
-              <w:color w:val="EE0000"/>
-            </w:rPr>
-            <m:t>1.91</m:t>
+            <m:t>=1.91</m:t>
           </m:r>
         </m:oMath>
       </m:oMathPara>
@@ -4368,14 +4027,7 @@
               <w:rFonts w:ascii="Cambria Math" w:hAnsi="Cambria Math" w:cs="Times New Roman"/>
               <w:color w:val="EE0000"/>
             </w:rPr>
-            <m:t>=0.5</m:t>
-          </m:r>
-          <m:r>
-            <w:rPr>
-              <w:rFonts w:ascii="Cambria Math" w:hAnsi="Cambria Math" w:cs="Times New Roman"/>
-              <w:color w:val="EE0000"/>
-            </w:rPr>
-            <m:t>42</m:t>
+            <m:t>=0.542</m:t>
           </m:r>
         </m:oMath>
       </m:oMathPara>

</xml_diff>